<commit_message>
docs: align requirements filenames with V1.3 version
Rename current source Word and matching text to v1_3, refresh links and version notes, and preserve archived V1.2 files.
</commit_message>
<xml_diff>
--- a/docs/requirements/platform-requirements-v1_3.docx
+++ b/docs/requirements/platform-requirements-v1_3.docx
@@ -46,18 +46,18 @@
         </w:r>
       </w:hyperlink>
       <w:r>
-        <w:t xml:space="preserve">。用户指定的</w:t>
+        <w:t xml:space="preserve">。</w:t>
       </w:r>
       <w:hyperlink r:id="rId22">
         <w:r>
           <w:rPr>
             <w:rStyle w:val="Hyperlink"/>
           </w:rPr>
-          <w:t xml:space="preserve">总体需求 Word 原链接</w:t>
+          <w:t xml:space="preserve">总体需求 Word V1.3</w:t>
         </w:r>
       </w:hyperlink>
       <w:r>
-        <w:t xml:space="preserve">已直接更新为本版（文件名保留 v1_2，文档内版本为 V1.3）；原始 V1.2 另存于</w:t>
+        <w:t xml:space="preserve">的文件名与文档内版本统一为 V1.3；原始 V1.2 另存于</w:t>
       </w:r>
       <w:r>
         <w:t xml:space="preserve"> </w:t>
@@ -103,7 +103,7 @@
               <a:graphicData uri="http://schemas.openxmlformats.org/drawingml/2006/picture">
                 <pic:pic>
                   <pic:nvPicPr>
-                    <pic:cNvPr descr="../assets/platform-business-framework-v1_3.png" id="25" name="Picture"/>
+                    <pic:cNvPr descr="/workspace/work/revision/docs/assets/platform-business-framework-v1_3.png" id="25" name="Picture"/>
                     <pic:cNvPicPr>
                       <a:picLocks noChangeArrowheads="1" noChangeAspect="1"/>
                     </pic:cNvPicPr>

</xml_diff>